<commit_message>
Sync the Slovenian Povzetek and cover letter with the corrected privacy result
The Povzetek still summarised the earlier abstract, including the retracted
claim that the metadata attacker reaches 0,478 (below chance) and that this
confirms the non-biometric property; the cover letter made the same claim in
English. Both now mirror the current abstract: the raw-audio attacker reaches
0,994, the undefended acoustic metadata still leaks moderate identity (0,816),
and the differentially-private release (epsilon = 4 per value) lowers
re-identification to 0,547 near chance while detection drops from 0,774 to
0,625. The Povzetek is also condensed to match the shortened English abstract.
verify_numbers.py now scans the builder-embedded Povzetek and the cover letter
for stale values in both decimal notations, so a retracted number cannot hide
in the Slovenian text again. Cover letter date refreshed.
</commit_message>
<xml_diff>
--- a/manuscript/Cover_Letter_Informatica.docx
+++ b/manuscript/Cover_Letter_Informatica.docx
@@ -50,7 +50,7 @@
           <w:i w:val="0"/>
           <w:sz w:val="22"/>
         </w:rPr>
-        <w:t>21 May 2026</w:t>
+        <w:t>10 June 2026</w:t>
       </w:r>
     </w:p>
     <w:p>
@@ -316,7 +316,7 @@
           <w:i w:val="0"/>
           <w:sz w:val="22"/>
         </w:rPr>
-        <w:t>Adversarial privacy verification.</w:t>
+        <w:t>Adversarial privacy verification with a measured mitigation.</w:t>
       </w:r>
       <w:r>
         <w:rPr>
@@ -325,7 +325,7 @@
           <w:i w:val="0"/>
           <w:sz w:val="22"/>
         </w:rPr>
-        <w:t xml:space="preserve"> The most novel contribution is a quantitative privacy test on 30 real LibriSpeech speakers: a raw-audio attacker achieves a re-identification AUC of 0.994, while the same attacker constrained to the metadata stream emitted by our system achieves only 0.478 (chance level). To the best of our knowledge no prior proctoring paper provides such empirical evidence.</w:t>
+        <w:t xml:space="preserve"> The most novel contribution is a quantitative privacy test on 30 real LibriSpeech speakers: a raw-audio attacker re-identifies speakers with AUC 0.994, and the content-free metadata our system emits still leaks moderate identity (AUC 0.816), an honest negative result showing that content-free does not imply identity-free. We then release the metadata through a differentially-private mechanism that lowers re-identification to 0.547 (near chance) at a quantified cost in detection accuracy, tracing the full privacy-utility curve. To the best of our knowledge no prior proctoring paper both measures metadata re-identifiability on real speakers and provides a differentially-private mitigation.</w:t>
       </w:r>
     </w:p>
     <w:p>

</xml_diff>